<commit_message>
Condense resume to fit on a single page
- Use compact fonts, margins, and tighter spacing
- Shorten profile and experience bullets while keeping key metrics
- Combine education, certificates, and skills in a two-column layout
- Merge courses into one compact line

Co-authored-by: metal ray <metal.ray7mr@gmail.com>
</commit_message>
<xml_diff>
--- a/resume/Abhishek_Purohit_Data_Engineer.docx
+++ b/resume/Abhishek_Purohit_Data_Engineer.docx
@@ -4,76 +4,88 @@
   <w:body>
     <w:p>
       <w:pPr>
+        <w:spacing w:before="0" w:after="0" w:line="220" w:lineRule="exact"/>
         <w:jc w:val="center"/>
       </w:pPr>
       <w:r>
         <w:rPr>
           <w:b/>
-          <w:sz w:val="36"/>
+          <w:sz w:val="28"/>
         </w:rPr>
         <w:t>Abhishek Purohit</w:t>
       </w:r>
     </w:p>
     <w:p>
       <w:pPr>
+        <w:spacing w:before="0" w:after="80" w:line="220" w:lineRule="exact"/>
         <w:jc w:val="center"/>
       </w:pPr>
       <w:r>
         <w:rPr>
-          <w:sz w:val="20"/>
+          <w:sz w:val="17"/>
         </w:rPr>
         <w:t>Data Engineer &amp; Analyst | +91-7060470209 | abhishek.purohit7ap@gmail.com</w:t>
       </w:r>
     </w:p>
     <w:p>
       <w:pPr>
-        <w:spacing w:after="80"/>
+        <w:spacing w:before="60" w:after="20" w:line="200" w:lineRule="exact"/>
       </w:pPr>
       <w:r>
         <w:rPr>
           <w:b/>
-          <w:sz w:val="22"/>
+          <w:sz w:val="18"/>
         </w:rPr>
         <w:t>PROFILE</w:t>
       </w:r>
     </w:p>
     <w:p>
+      <w:pPr>
+        <w:spacing w:before="0" w:after="20" w:line="200" w:lineRule="exact"/>
+      </w:pPr>
       <w:r>
         <w:rPr>
-          <w:sz w:val="20"/>
+          <w:b w:val="0"/>
+          <w:i w:val="0"/>
+          <w:sz w:val="16"/>
         </w:rPr>
-        <w:t>Experienced Data Analyst and Engineer with 8 years of expertise in ETL tools including PySpark, Python, SQL, Power BI, and Azure. Skilled in data integration, analysis, modeling, and data warehousing concepts. Proficient in designing and implementing ETL pipelines, working with big data technologies, and ensuring data quality. Adept at collaborating with cross-functional teams and communicating technical information to non-technical stakeholders. Passionate about leveraging data to drive innovation and optimize business operations.</w:t>
+        <w:t>Data Analyst and Engineer with 8 years of expertise in PySpark, Python, SQL, Power BI, and Azure. Skilled in ETL pipeline design, data warehousing, and big data technologies. Adept at collaborating with cross-functional teams and communicating insights to non-technical stakeholders.</w:t>
       </w:r>
     </w:p>
     <w:p>
       <w:pPr>
-        <w:spacing w:after="80"/>
+        <w:spacing w:before="60" w:after="20" w:line="200" w:lineRule="exact"/>
       </w:pPr>
       <w:r>
         <w:rPr>
           <w:b/>
-          <w:sz w:val="22"/>
+          <w:sz w:val="18"/>
         </w:rPr>
         <w:t>EXPERIENCE</w:t>
       </w:r>
     </w:p>
     <w:p>
       <w:pPr>
-        <w:spacing w:after="40"/>
+        <w:spacing w:before="0" w:after="20" w:line="200" w:lineRule="exact"/>
       </w:pPr>
       <w:r>
         <w:rPr>
           <w:b/>
-          <w:sz w:val="20"/>
+          <w:i w:val="0"/>
+          <w:sz w:val="16"/>
         </w:rPr>
         <w:t>McKinsey &amp; Company | Data Analyst</w:t>
       </w:r>
     </w:p>
     <w:p>
+      <w:pPr>
+        <w:spacing w:before="0" w:after="20" w:line="200" w:lineRule="exact"/>
+      </w:pPr>
       <w:r>
         <w:rPr>
+          <w:b w:val="0"/>
           <w:i/>
-          <w:sz w:val="20"/>
+          <w:sz w:val="16"/>
         </w:rPr>
         <w:t>Aug 2021 – Present | Gurgaon, IN</w:t>
       </w:r>
@@ -81,56 +93,49 @@
     <w:p>
       <w:pPr>
         <w:pStyle w:val="ListBullet"/>
-        <w:spacing w:after="40"/>
+        <w:spacing w:before="0" w:after="0" w:line="200" w:lineRule="exact"/>
       </w:pPr>
       <w:r>
         <w:rPr>
-          <w:sz w:val="20"/>
+          <w:sz w:val="16"/>
         </w:rPr>
-        <w:t>Helped clients solve problems and make better decisions using data, advanced analytics, and technology by leading CPG clients around the globe on data-driven marketing strategies, with a focus on helping them leverage the latest advances in tech-enablement to find, deliver, and sustain above-market growth of 16% YOY, profitability of $57 million, and price management.</w:t>
+        <w:t>Led CPG clients globally on data-driven marketing strategies, driving 16% YOY growth, $57M profitability, and price management using advanced analytics.</w:t>
       </w:r>
     </w:p>
     <w:p>
       <w:pPr>
         <w:pStyle w:val="ListBullet"/>
-        <w:spacing w:after="40"/>
+        <w:spacing w:before="0" w:after="0" w:line="200" w:lineRule="exact"/>
       </w:pPr>
       <w:r>
         <w:rPr>
-          <w:sz w:val="20"/>
+          <w:sz w:val="16"/>
         </w:rPr>
-        <w:t>Designed and deployed advanced analytics to deeply understand shopper and consumer behaviour and translate insights into actionable strategies in the areas of pricing, assortment, innovation, and branding.</w:t>
+        <w:t>Designed analytics for shopper behaviour; built Databricks reporting for governance, outlier detection, and Power BI KPI dashboards.</w:t>
       </w:r>
     </w:p>
     <w:p>
       <w:pPr>
-        <w:pStyle w:val="ListBullet"/>
-        <w:spacing w:after="40"/>
-      </w:pPr>
-      <w:r>
-        <w:rPr>
-          <w:sz w:val="20"/>
-        </w:rPr>
-        <w:t>Created an automated reporting system using Databricks to accelerate data governance and outlier detection. This system helped clients visualize critical KPIs in Power BI dashboards and minimize data anomalies.</w:t>
-      </w:r>
-    </w:p>
-    <w:p>
-      <w:pPr>
-        <w:spacing w:after="40"/>
+        <w:spacing w:before="0" w:after="20" w:line="200" w:lineRule="exact"/>
       </w:pPr>
       <w:r>
         <w:rPr>
           <w:b/>
-          <w:sz w:val="20"/>
+          <w:i w:val="0"/>
+          <w:sz w:val="16"/>
         </w:rPr>
         <w:t>HCL Technologies | Engineer Programming</w:t>
       </w:r>
     </w:p>
     <w:p>
+      <w:pPr>
+        <w:spacing w:before="0" w:after="20" w:line="200" w:lineRule="exact"/>
+      </w:pPr>
       <w:r>
         <w:rPr>
+          <w:b w:val="0"/>
           <w:i/>
-          <w:sz w:val="20"/>
+          <w:sz w:val="16"/>
         </w:rPr>
         <w:t>Jun 2019 – Aug 2021 | Noida, IN</w:t>
       </w:r>
@@ -138,68 +143,49 @@
     <w:p>
       <w:pPr>
         <w:pStyle w:val="ListBullet"/>
-        <w:spacing w:after="40"/>
+        <w:spacing w:before="0" w:after="0" w:line="200" w:lineRule="exact"/>
       </w:pPr>
       <w:r>
         <w:rPr>
-          <w:sz w:val="20"/>
+          <w:sz w:val="16"/>
         </w:rPr>
-        <w:t>Automated data processing using ADF for billions of rows of transactional data from SQL Server and Splunk to improve real-time reporting of product metrics.</w:t>
+        <w:t>Automated ADF pipelines for billions of transactional rows (SQL Server, Splunk); built Power BI reports saving 12 hrs/week.</w:t>
       </w:r>
     </w:p>
     <w:p>
       <w:pPr>
         <w:pStyle w:val="ListBullet"/>
-        <w:spacing w:after="40"/>
+        <w:spacing w:before="0" w:after="0" w:line="200" w:lineRule="exact"/>
       </w:pPr>
       <w:r>
         <w:rPr>
-          <w:sz w:val="20"/>
+          <w:sz w:val="16"/>
         </w:rPr>
-        <w:t>Worked with clients to understand business needs and translate those needs into actionable reports in Power BI, saving 12 hours of manual work each week.</w:t>
+        <w:t>Built Spark/Python ETL into Synapse/PolyBase; analysed access logs to flag 800 non-compliant users per audit standards.</w:t>
       </w:r>
     </w:p>
     <w:p>
       <w:pPr>
-        <w:pStyle w:val="ListBullet"/>
-        <w:spacing w:after="40"/>
-      </w:pPr>
-      <w:r>
-        <w:rPr>
-          <w:sz w:val="20"/>
-        </w:rPr>
-        <w:t>Implemented an ETL framework using Spark with Python and loaded standardized data into Synapse and PolyBase tables.</w:t>
-      </w:r>
-    </w:p>
-    <w:p>
-      <w:pPr>
-        <w:pStyle w:val="ListBullet"/>
-        <w:spacing w:after="40"/>
-      </w:pPr>
-      <w:r>
-        <w:rPr>
-          <w:sz w:val="20"/>
-        </w:rPr>
-        <w:t>Delivered insights into user productivity and their capacity utilization based on access card logs, breaking down how much time users spent on hourly, non-billable, and no-charge hours, which helped identify 800 non-compliant users as per audit standards.</w:t>
-      </w:r>
-    </w:p>
-    <w:p>
-      <w:pPr>
-        <w:spacing w:after="40"/>
+        <w:spacing w:before="0" w:after="20" w:line="200" w:lineRule="exact"/>
       </w:pPr>
       <w:r>
         <w:rPr>
           <w:b/>
-          <w:sz w:val="20"/>
+          <w:i w:val="0"/>
+          <w:sz w:val="16"/>
         </w:rPr>
         <w:t>IMSI Pvt Ltd | Associate</w:t>
       </w:r>
     </w:p>
     <w:p>
+      <w:pPr>
+        <w:spacing w:before="0" w:after="20" w:line="200" w:lineRule="exact"/>
+      </w:pPr>
       <w:r>
         <w:rPr>
+          <w:b w:val="0"/>
           <w:i/>
-          <w:sz w:val="20"/>
+          <w:sz w:val="16"/>
         </w:rPr>
         <w:t>Apr 2018 – Jun 2019 | Noida, IN</w:t>
       </w:r>
@@ -207,306 +193,162 @@
     <w:p>
       <w:pPr>
         <w:pStyle w:val="ListBullet"/>
-        <w:spacing w:after="40"/>
+        <w:spacing w:before="0" w:after="0" w:line="200" w:lineRule="exact"/>
       </w:pPr>
       <w:r>
         <w:rPr>
-          <w:sz w:val="20"/>
+          <w:sz w:val="16"/>
         </w:rPr>
-        <w:t>Collaborated on hands-on development of the data stack using Python and C# for maintaining data assets and business reports.</w:t>
+        <w:t>Developed data stack (Python, C#) on Azure/SSRS; implemented data quality checks and completed Azure Analytics POC in 3 months.</w:t>
       </w:r>
     </w:p>
     <w:p>
       <w:pPr>
-        <w:pStyle w:val="ListBullet"/>
-        <w:spacing w:after="40"/>
-      </w:pPr>
-      <w:r>
-        <w:rPr>
-          <w:sz w:val="20"/>
-        </w:rPr>
-        <w:t>Assisted in engineering and managing data models within the existing Azure and SSRS cloud environment.</w:t>
-      </w:r>
-    </w:p>
-    <w:p>
-      <w:pPr>
-        <w:pStyle w:val="ListBullet"/>
-        <w:spacing w:after="40"/>
-      </w:pPr>
-      <w:r>
-        <w:rPr>
-          <w:sz w:val="20"/>
-        </w:rPr>
-        <w:t>Developed data quality checks to adhere to high standards and scalable code.</w:t>
-      </w:r>
-    </w:p>
-    <w:p>
-      <w:pPr>
-        <w:pStyle w:val="ListBullet"/>
-        <w:spacing w:after="40"/>
-      </w:pPr>
-      <w:r>
-        <w:rPr>
-          <w:sz w:val="20"/>
-        </w:rPr>
-        <w:t>Completed a POC with Microsoft for deploying an Azure Data and Analytics solution with a turnaround of 3 months.</w:t>
-      </w:r>
-    </w:p>
-    <w:p>
-      <w:pPr>
-        <w:spacing w:after="80"/>
+        <w:spacing w:before="60" w:after="20" w:line="200" w:lineRule="exact"/>
       </w:pPr>
       <w:r>
         <w:rPr>
           <w:b/>
-          <w:sz w:val="22"/>
+          <w:sz w:val="18"/>
         </w:rPr>
         <w:t>TECH STACK</w:t>
       </w:r>
     </w:p>
     <w:p>
+      <w:pPr>
+        <w:spacing w:before="0" w:after="20" w:line="200" w:lineRule="exact"/>
+      </w:pPr>
       <w:r>
         <w:rPr>
-          <w:sz w:val="20"/>
+          <w:b w:val="0"/>
+          <w:i w:val="0"/>
+          <w:sz w:val="16"/>
         </w:rPr>
-        <w:t>Data: Pandas, NumPy, Alteryx, Power BI, PySpark, Databricks, HDInsight, Snowflake, Azure Data Factory, Airflow, ReactJS</w:t>
+        <w:t>Data: Pandas, NumPy, Alteryx, Power BI, PySpark, Databricks, Snowflake, ADF, Airflow  |  Cloud: Azure Synapse, Fabric, Functions, Logic Apps  |  DevOps: CI/CD, Docker, GitLab, Splunk  |  DB: PostgreSQL, Vertica, SQL Server, MongoDB, Delta Lake</w:t>
       </w:r>
     </w:p>
-    <w:p>
-      <w:r>
-        <w:rPr>
-          <w:sz w:val="20"/>
-        </w:rPr>
-        <w:t>Cloud: Logic App, Azure Functions, ETL, Azure Synapse, Azure Fabric, API</w:t>
-      </w:r>
-    </w:p>
-    <w:p>
-      <w:r>
-        <w:rPr>
-          <w:sz w:val="20"/>
-        </w:rPr>
-        <w:t>DevOps: CI/CD, Docker, Shell, Splunk, GitLab</w:t>
-      </w:r>
-    </w:p>
-    <w:p>
-      <w:r>
-        <w:rPr>
-          <w:sz w:val="20"/>
-        </w:rPr>
-        <w:t>Database: PostgreSQL, Vertica DB, Azure Synapse, SQL Server, MongoDB (NoSQL), Delta Lake</w:t>
-      </w:r>
-    </w:p>
+    <w:tbl>
+      <w:tblPr>
+        <w:tblW w:type="auto" w:w="0"/>
+        <w:tblLayout w:type="autofit"/>
+        <w:tblLook w:firstColumn="1" w:firstRow="1" w:lastColumn="0" w:lastRow="0" w:noHBand="0" w:noVBand="1" w:val="04A0"/>
+      </w:tblPr>
+      <w:tblGrid>
+        <w:gridCol w:w="5400"/>
+        <w:gridCol w:w="5400"/>
+      </w:tblGrid>
+      <w:tr>
+        <w:tc>
+          <w:tcPr>
+            <w:tcW w:type="dxa" w:w="5400"/>
+          </w:tcPr>
+          <w:p>
+            <w:r>
+              <w:rPr>
+                <w:b/>
+              </w:rPr>
+              <w:t>EDUCATION</w:t>
+            </w:r>
+          </w:p>
+          <w:p>
+            <w:pPr>
+              <w:spacing w:before="0" w:after="0" w:line="200" w:lineRule="exact"/>
+            </w:pPr>
+            <w:r>
+              <w:rPr>
+                <w:sz w:val="16"/>
+              </w:rPr>
+              <w:t>BITS Pilani — M.Tech, Data Science &amp; Engineering (Oct 2022)</w:t>
+            </w:r>
+          </w:p>
+          <w:p>
+            <w:pPr>
+              <w:spacing w:before="0" w:after="0" w:line="200" w:lineRule="exact"/>
+            </w:pPr>
+            <w:r>
+              <w:rPr>
+                <w:sz w:val="16"/>
+              </w:rPr>
+              <w:t>UTU Tehri — B.Tech, Electronics &amp; Communication (July 2017)</w:t>
+            </w:r>
+          </w:p>
+        </w:tc>
+        <w:tc>
+          <w:tcPr>
+            <w:tcW w:type="dxa" w:w="5400"/>
+          </w:tcPr>
+          <w:p>
+            <w:r>
+              <w:rPr>
+                <w:b/>
+              </w:rPr>
+              <w:t>CERTIFICATES &amp; SKILLS</w:t>
+            </w:r>
+          </w:p>
+          <w:p>
+            <w:pPr>
+              <w:spacing w:before="0" w:after="0" w:line="200" w:lineRule="exact"/>
+            </w:pPr>
+            <w:r>
+              <w:rPr>
+                <w:sz w:val="16"/>
+              </w:rPr>
+              <w:t>DA 100 | DA 900 | AZ 900 | Open Hack | Applied AI</w:t>
+            </w:r>
+          </w:p>
+          <w:p>
+            <w:pPr>
+              <w:spacing w:before="0" w:after="0" w:line="200" w:lineRule="exact"/>
+            </w:pPr>
+            <w:r>
+              <w:rPr>
+                <w:sz w:val="16"/>
+              </w:rPr>
+              <w:t>Python | JavaScript | C# | SQL</w:t>
+            </w:r>
+          </w:p>
+          <w:p>
+            <w:pPr>
+              <w:spacing w:before="0" w:after="0" w:line="200" w:lineRule="exact"/>
+            </w:pPr>
+            <w:r>
+              <w:rPr>
+                <w:sz w:val="16"/>
+              </w:rPr>
+              <w:t>English | Hindi</w:t>
+            </w:r>
+          </w:p>
+        </w:tc>
+      </w:tr>
+    </w:tbl>
     <w:p>
       <w:pPr>
-        <w:spacing w:after="80"/>
+        <w:spacing w:before="60" w:after="20" w:line="200" w:lineRule="exact"/>
       </w:pPr>
       <w:r>
         <w:rPr>
           <w:b/>
-          <w:sz w:val="22"/>
-        </w:rPr>
-        <w:t>EDUCATION</w:t>
-      </w:r>
-    </w:p>
-    <w:p>
-      <w:r>
-        <w:rPr>
-          <w:b/>
-          <w:sz w:val="20"/>
-        </w:rPr>
-        <w:t>BITS Pilani | M.Tech</w:t>
-      </w:r>
-    </w:p>
-    <w:p>
-      <w:r>
-        <w:rPr>
-          <w:i/>
-          <w:sz w:val="20"/>
-        </w:rPr>
-        <w:t>Oct 2022 | 24 Months</w:t>
-      </w:r>
-    </w:p>
-    <w:p>
-      <w:r>
-        <w:rPr>
-          <w:sz w:val="20"/>
-        </w:rPr>
-        <w:t>Data Science and Engineering</w:t>
-      </w:r>
-    </w:p>
-    <w:p>
-      <w:r>
-        <w:rPr>
-          <w:b/>
-          <w:sz w:val="20"/>
-        </w:rPr>
-        <w:t>UTU Tehri | B.Tech</w:t>
-      </w:r>
-    </w:p>
-    <w:p>
-      <w:r>
-        <w:rPr>
-          <w:i/>
-          <w:sz w:val="20"/>
-        </w:rPr>
-        <w:t>July 2017 | 48 Months</w:t>
-      </w:r>
-    </w:p>
-    <w:p>
-      <w:r>
-        <w:rPr>
-          <w:sz w:val="20"/>
-        </w:rPr>
-        <w:t>Electronics &amp; Communication Engineering</w:t>
-      </w:r>
-    </w:p>
-    <w:p>
-      <w:pPr>
-        <w:spacing w:after="80"/>
-      </w:pPr>
-      <w:r>
-        <w:rPr>
-          <w:b/>
-          <w:sz w:val="22"/>
+          <w:sz w:val="18"/>
         </w:rPr>
         <w:t>COURSES</w:t>
       </w:r>
     </w:p>
     <w:p>
-      <w:r>
-        <w:rPr>
-          <w:b/>
-          <w:sz w:val="20"/>
-        </w:rPr>
-        <w:t>Advanced Data Science | IBM</w:t>
-      </w:r>
-    </w:p>
-    <w:p>
-      <w:r>
-        <w:rPr>
-          <w:i/>
-          <w:sz w:val="20"/>
-        </w:rPr>
-        <w:t>Feb 2019 | 3 Months</w:t>
-      </w:r>
-    </w:p>
-    <w:p>
-      <w:r>
-        <w:rPr>
-          <w:b/>
-          <w:sz w:val="20"/>
-        </w:rPr>
-        <w:t>Deep Learning | IIT Madras</w:t>
-      </w:r>
-    </w:p>
-    <w:p>
-      <w:r>
-        <w:rPr>
-          <w:i/>
-          <w:sz w:val="20"/>
-        </w:rPr>
-        <w:t>Oct 2018 | 4 Months</w:t>
-      </w:r>
-    </w:p>
-    <w:p>
-      <w:r>
-        <w:rPr>
-          <w:b/>
-          <w:sz w:val="20"/>
-        </w:rPr>
-        <w:t>Machine Learning | IIT Madras</w:t>
-      </w:r>
-    </w:p>
-    <w:p>
-      <w:r>
-        <w:rPr>
-          <w:i/>
-          <w:sz w:val="20"/>
-        </w:rPr>
-        <w:t>Sep 2018 | 2 Months</w:t>
-      </w:r>
-    </w:p>
-    <w:p>
-      <w:r>
-        <w:rPr>
-          <w:b/>
-          <w:sz w:val="20"/>
-        </w:rPr>
-        <w:t>Node.js Master Class | Pirple</w:t>
-      </w:r>
-    </w:p>
-    <w:p>
-      <w:r>
-        <w:rPr>
-          <w:i/>
-          <w:sz w:val="20"/>
-        </w:rPr>
-        <w:t>Apr 2018 | 3 Months</w:t>
-      </w:r>
-    </w:p>
-    <w:p>
       <w:pPr>
-        <w:spacing w:after="80"/>
+        <w:spacing w:before="0" w:after="20" w:line="200" w:lineRule="exact"/>
       </w:pPr>
       <w:r>
         <w:rPr>
-          <w:b/>
-          <w:sz w:val="22"/>
+          <w:b w:val="0"/>
+          <w:i w:val="0"/>
+          <w:sz w:val="16"/>
         </w:rPr>
-        <w:t>CERTIFICATES</w:t>
-      </w:r>
-    </w:p>
-    <w:p>
-      <w:r>
-        <w:rPr>
-          <w:sz w:val="20"/>
-        </w:rPr>
-        <w:t>DA 100 | DA 900 | AZ 900 | Open Hack | Applied AI</w:t>
-      </w:r>
-    </w:p>
-    <w:p>
-      <w:pPr>
-        <w:spacing w:after="80"/>
-      </w:pPr>
-      <w:r>
-        <w:rPr>
-          <w:b/>
-          <w:sz w:val="22"/>
-        </w:rPr>
-        <w:t>SKILLS</w:t>
-      </w:r>
-    </w:p>
-    <w:p>
-      <w:r>
-        <w:rPr>
-          <w:sz w:val="20"/>
-        </w:rPr>
-        <w:t>Python | JavaScript | C# | SQL</w:t>
-      </w:r>
-    </w:p>
-    <w:p>
-      <w:pPr>
-        <w:spacing w:after="80"/>
-      </w:pPr>
-      <w:r>
-        <w:rPr>
-          <w:b/>
-          <w:sz w:val="22"/>
-        </w:rPr>
-        <w:t>LANGUAGES</w:t>
-      </w:r>
-    </w:p>
-    <w:p>
-      <w:r>
-        <w:rPr>
-          <w:sz w:val="20"/>
-        </w:rPr>
-        <w:t>English | Hindi</w:t>
+        <w:t>Advanced Data Science (IBM) | Deep Learning (IIT Madras) | Machine Learning (IIT Madras) | Node.js (Pirple)</w:t>
       </w:r>
     </w:p>
     <w:sectPr>
       <w:pgSz w:w="12240" w:h="15840"/>
-      <w:pgMar w:top="864" w:right="1080" w:bottom="864" w:left="1080" w:header="720" w:footer="720" w:gutter="0"/>
+      <w:pgMar w:top="576" w:right="720" w:bottom="576" w:left="720" w:header="720" w:footer="720" w:gutter="0"/>
       <w:cols w:space="720"/>
       <w:docGrid w:linePitch="360"/>
     </w:sectPr>

</xml_diff>

<commit_message>
Restore full resume content and fit to one page via layout only
Reverts condensed text changes; keeps all original bullets and sections
from the grammar-fixed version while using tighter spacing and a two-column
layout for bottom sections to eliminate the second page.

Co-authored-by: metal ray <metal.ray7mr@gmail.com>
</commit_message>
<xml_diff>
--- a/resume/Abhishek_Purohit_Data_Engineer.docx
+++ b/resume/Abhishek_Purohit_Data_Engineer.docx
@@ -4,7 +4,7 @@
   <w:body>
     <w:p>
       <w:pPr>
-        <w:spacing w:before="0" w:after="0" w:line="220" w:lineRule="exact"/>
+        <w:spacing w:after="0"/>
         <w:jc w:val="center"/>
       </w:pPr>
       <w:r>
@@ -17,7 +17,7 @@
     </w:p>
     <w:p>
       <w:pPr>
-        <w:spacing w:before="0" w:after="80" w:line="220" w:lineRule="exact"/>
+        <w:spacing w:after="80"/>
         <w:jc w:val="center"/>
       </w:pPr>
       <w:r>
@@ -29,7 +29,7 @@
     </w:p>
     <w:p>
       <w:pPr>
-        <w:spacing w:before="60" w:after="20" w:line="200" w:lineRule="exact"/>
+        <w:spacing w:after="40" w:before="60"/>
       </w:pPr>
       <w:r>
         <w:rPr>
@@ -41,20 +41,18 @@
     </w:p>
     <w:p>
       <w:pPr>
-        <w:spacing w:before="0" w:after="20" w:line="200" w:lineRule="exact"/>
+        <w:spacing w:line="200" w:lineRule="exact"/>
       </w:pPr>
       <w:r>
         <w:rPr>
-          <w:b w:val="0"/>
-          <w:i w:val="0"/>
           <w:sz w:val="16"/>
         </w:rPr>
-        <w:t>Data Analyst and Engineer with 8 years of expertise in PySpark, Python, SQL, Power BI, and Azure. Skilled in ETL pipeline design, data warehousing, and big data technologies. Adept at collaborating with cross-functional teams and communicating insights to non-technical stakeholders.</w:t>
+        <w:t>Experienced Data Analyst and Engineer with 8 years of expertise in ETL tools including PySpark, Python, SQL, Power BI, and Azure. Skilled in data integration, analysis, modeling, and data warehousing concepts. Proficient in designing and implementing ETL pipelines, working with big data technologies, and ensuring data quality. Adept at collaborating with cross-functional teams and communicating technical information to non-technical stakeholders. Passionate about leveraging data to drive innovation and optimize business operations.</w:t>
       </w:r>
     </w:p>
     <w:p>
       <w:pPr>
-        <w:spacing w:before="60" w:after="20" w:line="200" w:lineRule="exact"/>
+        <w:spacing w:after="40" w:before="60"/>
       </w:pPr>
       <w:r>
         <w:rPr>
@@ -66,12 +64,11 @@
     </w:p>
     <w:p>
       <w:pPr>
-        <w:spacing w:before="0" w:after="20" w:line="200" w:lineRule="exact"/>
+        <w:spacing w:after="0" w:before="40"/>
       </w:pPr>
       <w:r>
         <w:rPr>
           <w:b/>
-          <w:i w:val="0"/>
           <w:sz w:val="16"/>
         </w:rPr>
         <w:t>McKinsey &amp; Company | Data Analyst</w:t>
@@ -79,11 +76,10 @@
     </w:p>
     <w:p>
       <w:pPr>
-        <w:spacing w:before="0" w:after="20" w:line="200" w:lineRule="exact"/>
+        <w:spacing w:after="0"/>
       </w:pPr>
       <w:r>
         <w:rPr>
-          <w:b w:val="0"/>
           <w:i/>
           <w:sz w:val="16"/>
         </w:rPr>
@@ -93,35 +89,46 @@
     <w:p>
       <w:pPr>
         <w:pStyle w:val="ListBullet"/>
-        <w:spacing w:before="0" w:after="0" w:line="200" w:lineRule="exact"/>
+        <w:spacing w:after="0" w:line="200" w:lineRule="exact"/>
       </w:pPr>
       <w:r>
         <w:rPr>
           <w:sz w:val="16"/>
         </w:rPr>
-        <w:t>Led CPG clients globally on data-driven marketing strategies, driving 16% YOY growth, $57M profitability, and price management using advanced analytics.</w:t>
+        <w:t>Helped clients solve problems and make better decisions using data, advanced analytics, and technology by leading CPG clients around the globe on data-driven marketing strategies, with a focus on helping them leverage the latest advances in tech-enablement to find, deliver, and sustain above-market growth of 16% YOY, profitability of $57 million, and price management.</w:t>
       </w:r>
     </w:p>
     <w:p>
       <w:pPr>
         <w:pStyle w:val="ListBullet"/>
-        <w:spacing w:before="0" w:after="0" w:line="200" w:lineRule="exact"/>
+        <w:spacing w:after="0" w:line="200" w:lineRule="exact"/>
       </w:pPr>
       <w:r>
         <w:rPr>
           <w:sz w:val="16"/>
         </w:rPr>
-        <w:t>Designed analytics for shopper behaviour; built Databricks reporting for governance, outlier detection, and Power BI KPI dashboards.</w:t>
+        <w:t>Designed and deployed advanced analytics to deeply understand shopper and consumer behaviour and translate insights into actionable strategies in the areas of pricing, assortment, innovation, and branding.</w:t>
       </w:r>
     </w:p>
     <w:p>
       <w:pPr>
-        <w:spacing w:before="0" w:after="20" w:line="200" w:lineRule="exact"/>
+        <w:pStyle w:val="ListBullet"/>
+        <w:spacing w:after="0" w:line="200" w:lineRule="exact"/>
+      </w:pPr>
+      <w:r>
+        <w:rPr>
+          <w:sz w:val="16"/>
+        </w:rPr>
+        <w:t>Created an automated reporting system using Databricks to accelerate data governance and outlier detection. This system helped clients visualize critical KPIs in Power BI dashboards and minimize data anomalies.</w:t>
+      </w:r>
+    </w:p>
+    <w:p>
+      <w:pPr>
+        <w:spacing w:after="0" w:before="40"/>
       </w:pPr>
       <w:r>
         <w:rPr>
           <w:b/>
-          <w:i w:val="0"/>
           <w:sz w:val="16"/>
         </w:rPr>
         <w:t>HCL Technologies | Engineer Programming</w:t>
@@ -129,11 +136,10 @@
     </w:p>
     <w:p>
       <w:pPr>
-        <w:spacing w:before="0" w:after="20" w:line="200" w:lineRule="exact"/>
+        <w:spacing w:after="0"/>
       </w:pPr>
       <w:r>
         <w:rPr>
-          <w:b w:val="0"/>
           <w:i/>
           <w:sz w:val="16"/>
         </w:rPr>
@@ -143,35 +149,58 @@
     <w:p>
       <w:pPr>
         <w:pStyle w:val="ListBullet"/>
-        <w:spacing w:before="0" w:after="0" w:line="200" w:lineRule="exact"/>
+        <w:spacing w:after="0" w:line="200" w:lineRule="exact"/>
       </w:pPr>
       <w:r>
         <w:rPr>
           <w:sz w:val="16"/>
         </w:rPr>
-        <w:t>Automated ADF pipelines for billions of transactional rows (SQL Server, Splunk); built Power BI reports saving 12 hrs/week.</w:t>
+        <w:t>Automated data processing using ADF for billions of rows of transactional data from SQL Server and Splunk to improve real-time reporting of product metrics.</w:t>
       </w:r>
     </w:p>
     <w:p>
       <w:pPr>
         <w:pStyle w:val="ListBullet"/>
-        <w:spacing w:before="0" w:after="0" w:line="200" w:lineRule="exact"/>
+        <w:spacing w:after="0" w:line="200" w:lineRule="exact"/>
       </w:pPr>
       <w:r>
         <w:rPr>
           <w:sz w:val="16"/>
         </w:rPr>
-        <w:t>Built Spark/Python ETL into Synapse/PolyBase; analysed access logs to flag 800 non-compliant users per audit standards.</w:t>
+        <w:t>Worked with clients to understand business needs and translate those needs into actionable reports in Power BI, saving 12 hours of manual work each week.</w:t>
       </w:r>
     </w:p>
     <w:p>
       <w:pPr>
-        <w:spacing w:before="0" w:after="20" w:line="200" w:lineRule="exact"/>
+        <w:pStyle w:val="ListBullet"/>
+        <w:spacing w:after="0" w:line="200" w:lineRule="exact"/>
+      </w:pPr>
+      <w:r>
+        <w:rPr>
+          <w:sz w:val="16"/>
+        </w:rPr>
+        <w:t>Implemented an ETL framework using Spark with Python and loaded standardized data into Synapse and PolyBase tables.</w:t>
+      </w:r>
+    </w:p>
+    <w:p>
+      <w:pPr>
+        <w:pStyle w:val="ListBullet"/>
+        <w:spacing w:after="0" w:line="200" w:lineRule="exact"/>
+      </w:pPr>
+      <w:r>
+        <w:rPr>
+          <w:sz w:val="16"/>
+        </w:rPr>
+        <w:t>Delivered insights into user productivity and their capacity utilization based on access card logs, breaking down how much time users spent on hourly, non-billable, and no-charge hours, which helped identify 800 non-compliant users as per audit standards.</w:t>
+      </w:r>
+    </w:p>
+    <w:p>
+      <w:pPr>
+        <w:spacing w:after="0" w:before="40"/>
       </w:pPr>
       <w:r>
         <w:rPr>
           <w:b/>
-          <w:i w:val="0"/>
           <w:sz w:val="16"/>
         </w:rPr>
         <w:t>IMSI Pvt Ltd | Associate</w:t>
@@ -179,11 +208,10 @@
     </w:p>
     <w:p>
       <w:pPr>
-        <w:spacing w:before="0" w:after="20" w:line="200" w:lineRule="exact"/>
+        <w:spacing w:after="0"/>
       </w:pPr>
       <w:r>
         <w:rPr>
-          <w:b w:val="0"/>
           <w:i/>
           <w:sz w:val="16"/>
         </w:rPr>
@@ -193,44 +221,54 @@
     <w:p>
       <w:pPr>
         <w:pStyle w:val="ListBullet"/>
-        <w:spacing w:before="0" w:after="0" w:line="200" w:lineRule="exact"/>
+        <w:spacing w:after="0" w:line="200" w:lineRule="exact"/>
       </w:pPr>
       <w:r>
         <w:rPr>
           <w:sz w:val="16"/>
         </w:rPr>
-        <w:t>Developed data stack (Python, C#) on Azure/SSRS; implemented data quality checks and completed Azure Analytics POC in 3 months.</w:t>
+        <w:t>Collaborated on hands-on development of the data stack using Python and C# for maintaining data assets and business reports.</w:t>
       </w:r>
     </w:p>
     <w:p>
       <w:pPr>
-        <w:spacing w:before="60" w:after="20" w:line="200" w:lineRule="exact"/>
+        <w:pStyle w:val="ListBullet"/>
+        <w:spacing w:after="0" w:line="200" w:lineRule="exact"/>
       </w:pPr>
       <w:r>
         <w:rPr>
-          <w:b/>
-          <w:sz w:val="18"/>
+          <w:sz w:val="16"/>
         </w:rPr>
-        <w:t>TECH STACK</w:t>
+        <w:t>Assisted in engineering and managing data models within the existing Azure and SSRS cloud environment.</w:t>
       </w:r>
     </w:p>
     <w:p>
       <w:pPr>
-        <w:spacing w:before="0" w:after="20" w:line="200" w:lineRule="exact"/>
+        <w:pStyle w:val="ListBullet"/>
+        <w:spacing w:after="0" w:line="200" w:lineRule="exact"/>
       </w:pPr>
       <w:r>
         <w:rPr>
-          <w:b w:val="0"/>
-          <w:i w:val="0"/>
           <w:sz w:val="16"/>
         </w:rPr>
-        <w:t>Data: Pandas, NumPy, Alteryx, Power BI, PySpark, Databricks, Snowflake, ADF, Airflow  |  Cloud: Azure Synapse, Fabric, Functions, Logic Apps  |  DevOps: CI/CD, Docker, GitLab, Splunk  |  DB: PostgreSQL, Vertica, SQL Server, MongoDB, Delta Lake</w:t>
+        <w:t>Developed data quality checks to adhere to high standards and scalable code.</w:t>
+      </w:r>
+    </w:p>
+    <w:p>
+      <w:pPr>
+        <w:pStyle w:val="ListBullet"/>
+        <w:spacing w:after="0" w:line="200" w:lineRule="exact"/>
+      </w:pPr>
+      <w:r>
+        <w:rPr>
+          <w:sz w:val="16"/>
+        </w:rPr>
+        <w:t>Completed a POC with Microsoft for deploying an Azure Data and Analytics solution with a turnaround of 3 months.</w:t>
       </w:r>
     </w:p>
     <w:tbl>
       <w:tblPr>
         <w:tblW w:type="auto" w:w="0"/>
-        <w:tblLayout w:type="autofit"/>
         <w:tblLook w:firstColumn="1" w:firstRow="1" w:lastColumn="0" w:lastRow="0" w:noHBand="0" w:noVBand="1" w:val="04A0"/>
       </w:tblPr>
       <w:tblGrid>
@@ -247,29 +285,215 @@
               <w:rPr>
                 <w:b/>
               </w:rPr>
-              <w:t>EDUCATION</w:t>
+              <w:t>TECH STACK</w:t>
             </w:r>
           </w:p>
           <w:p>
             <w:pPr>
-              <w:spacing w:before="0" w:after="0" w:line="200" w:lineRule="exact"/>
+              <w:spacing w:after="0" w:line="200" w:lineRule="exact"/>
             </w:pPr>
             <w:r>
               <w:rPr>
                 <w:sz w:val="16"/>
               </w:rPr>
-              <w:t>BITS Pilani — M.Tech, Data Science &amp; Engineering (Oct 2022)</w:t>
+              <w:t>Data: Pandas, NumPy, Alteryx, Power BI, PySpark, Databricks, HDInsight, Snowflake, Azure Data Factory, Airflow, ReactJS</w:t>
             </w:r>
           </w:p>
           <w:p>
             <w:pPr>
-              <w:spacing w:before="0" w:after="0" w:line="200" w:lineRule="exact"/>
+              <w:spacing w:after="0" w:line="200" w:lineRule="exact"/>
             </w:pPr>
             <w:r>
               <w:rPr>
                 <w:sz w:val="16"/>
               </w:rPr>
-              <w:t>UTU Tehri — B.Tech, Electronics &amp; Communication (July 2017)</w:t>
+              <w:t>Cloud: Logic App, Azure Functions, ETL, Azure Synapse, Azure Fabric, API</w:t>
+            </w:r>
+          </w:p>
+          <w:p>
+            <w:pPr>
+              <w:spacing w:after="0" w:line="200" w:lineRule="exact"/>
+            </w:pPr>
+            <w:r>
+              <w:rPr>
+                <w:sz w:val="16"/>
+              </w:rPr>
+              <w:t>DevOps: CI/CD, Docker, Shell, Splunk, GitLab</w:t>
+            </w:r>
+          </w:p>
+          <w:p>
+            <w:pPr>
+              <w:spacing w:after="0" w:line="200" w:lineRule="exact"/>
+            </w:pPr>
+            <w:r>
+              <w:rPr>
+                <w:sz w:val="16"/>
+              </w:rPr>
+              <w:t>Database: PostgreSQL, Vertica DB, Azure Synapse, SQL Server, MongoDB (NoSQL), Delta Lake</w:t>
+            </w:r>
+          </w:p>
+          <w:p>
+            <w:r>
+              <w:rPr>
+                <w:b/>
+              </w:rPr>
+              <w:t>EDUCATION</w:t>
+            </w:r>
+          </w:p>
+          <w:p>
+            <w:r>
+              <w:rPr>
+                <w:b/>
+                <w:sz w:val="16"/>
+              </w:rPr>
+              <w:t>BITS Pilani | M.Tech</w:t>
+            </w:r>
+          </w:p>
+          <w:p>
+            <w:pPr>
+              <w:spacing w:after="0"/>
+            </w:pPr>
+            <w:r>
+              <w:rPr>
+                <w:i/>
+                <w:sz w:val="16"/>
+              </w:rPr>
+              <w:t>Oct 2022 | 24 Months</w:t>
+            </w:r>
+          </w:p>
+          <w:p>
+            <w:pPr>
+              <w:spacing w:after="0"/>
+            </w:pPr>
+            <w:r>
+              <w:rPr>
+                <w:sz w:val="16"/>
+              </w:rPr>
+              <w:t>Data Science and Engineering</w:t>
+            </w:r>
+          </w:p>
+          <w:p>
+            <w:r>
+              <w:rPr>
+                <w:b/>
+                <w:sz w:val="16"/>
+              </w:rPr>
+              <w:t>UTU Tehri | B.Tech</w:t>
+            </w:r>
+          </w:p>
+          <w:p>
+            <w:pPr>
+              <w:spacing w:after="0"/>
+            </w:pPr>
+            <w:r>
+              <w:rPr>
+                <w:i/>
+                <w:sz w:val="16"/>
+              </w:rPr>
+              <w:t>July 2017 | 48 Months</w:t>
+            </w:r>
+          </w:p>
+          <w:p>
+            <w:pPr>
+              <w:spacing w:after="0"/>
+            </w:pPr>
+            <w:r>
+              <w:rPr>
+                <w:sz w:val="16"/>
+              </w:rPr>
+              <w:t>Electronics &amp; Communication Engineering</w:t>
+            </w:r>
+          </w:p>
+          <w:p>
+            <w:r>
+              <w:rPr>
+                <w:b/>
+              </w:rPr>
+              <w:t>COURSES</w:t>
+            </w:r>
+          </w:p>
+          <w:p>
+            <w:r>
+              <w:rPr>
+                <w:b/>
+                <w:sz w:val="16"/>
+              </w:rPr>
+              <w:t>Advanced Data Science | IBM</w:t>
+            </w:r>
+          </w:p>
+          <w:p>
+            <w:pPr>
+              <w:spacing w:after="0"/>
+            </w:pPr>
+            <w:r>
+              <w:rPr>
+                <w:i/>
+                <w:sz w:val="16"/>
+              </w:rPr>
+              <w:t>Feb 2019 | 3 Months</w:t>
+            </w:r>
+          </w:p>
+          <w:p>
+            <w:r>
+              <w:rPr>
+                <w:b/>
+                <w:sz w:val="16"/>
+              </w:rPr>
+              <w:t>Deep Learning | IIT Madras</w:t>
+            </w:r>
+          </w:p>
+          <w:p>
+            <w:pPr>
+              <w:spacing w:after="0"/>
+            </w:pPr>
+            <w:r>
+              <w:rPr>
+                <w:i/>
+                <w:sz w:val="16"/>
+              </w:rPr>
+              <w:t>Oct 2018 | 4 Months</w:t>
+            </w:r>
+          </w:p>
+          <w:p>
+            <w:r>
+              <w:rPr>
+                <w:b/>
+                <w:sz w:val="16"/>
+              </w:rPr>
+              <w:t>Machine Learning | IIT Madras</w:t>
+            </w:r>
+          </w:p>
+          <w:p>
+            <w:pPr>
+              <w:spacing w:after="0"/>
+            </w:pPr>
+            <w:r>
+              <w:rPr>
+                <w:i/>
+                <w:sz w:val="16"/>
+              </w:rPr>
+              <w:t>Sep 2018 | 2 Months</w:t>
+            </w:r>
+          </w:p>
+          <w:p>
+            <w:r>
+              <w:rPr>
+                <w:b/>
+                <w:sz w:val="16"/>
+              </w:rPr>
+              <w:t>Node.js Master Class | Pirple</w:t>
+            </w:r>
+          </w:p>
+          <w:p>
+            <w:pPr>
+              <w:spacing w:after="0"/>
+            </w:pPr>
+            <w:r>
+              <w:rPr>
+                <w:i/>
+                <w:sz w:val="16"/>
+              </w:rPr>
+              <w:t>Apr 2018 | 3 Months</w:t>
             </w:r>
           </w:p>
         </w:tc>
@@ -282,13 +506,10 @@
               <w:rPr>
                 <w:b/>
               </w:rPr>
-              <w:t>CERTIFICATES &amp; SKILLS</w:t>
+              <w:t>CERTIFICATES</w:t>
             </w:r>
           </w:p>
           <w:p>
-            <w:pPr>
-              <w:spacing w:before="0" w:after="0" w:line="200" w:lineRule="exact"/>
-            </w:pPr>
             <w:r>
               <w:rPr>
                 <w:sz w:val="16"/>
@@ -297,9 +518,14 @@
             </w:r>
           </w:p>
           <w:p>
-            <w:pPr>
-              <w:spacing w:before="0" w:after="0" w:line="200" w:lineRule="exact"/>
-            </w:pPr>
+            <w:r>
+              <w:rPr>
+                <w:b/>
+              </w:rPr>
+              <w:t>SKILLS</w:t>
+            </w:r>
+          </w:p>
+          <w:p>
             <w:r>
               <w:rPr>
                 <w:sz w:val="16"/>
@@ -308,9 +534,14 @@
             </w:r>
           </w:p>
           <w:p>
-            <w:pPr>
-              <w:spacing w:before="0" w:after="0" w:line="200" w:lineRule="exact"/>
-            </w:pPr>
+            <w:r>
+              <w:rPr>
+                <w:b/>
+              </w:rPr>
+              <w:t>LANGUAGES</w:t>
+            </w:r>
+          </w:p>
+          <w:p>
             <w:r>
               <w:rPr>
                 <w:sz w:val="16"/>
@@ -321,31 +552,6 @@
         </w:tc>
       </w:tr>
     </w:tbl>
-    <w:p>
-      <w:pPr>
-        <w:spacing w:before="60" w:after="20" w:line="200" w:lineRule="exact"/>
-      </w:pPr>
-      <w:r>
-        <w:rPr>
-          <w:b/>
-          <w:sz w:val="18"/>
-        </w:rPr>
-        <w:t>COURSES</w:t>
-      </w:r>
-    </w:p>
-    <w:p>
-      <w:pPr>
-        <w:spacing w:before="0" w:after="20" w:line="200" w:lineRule="exact"/>
-      </w:pPr>
-      <w:r>
-        <w:rPr>
-          <w:b w:val="0"/>
-          <w:i w:val="0"/>
-          <w:sz w:val="16"/>
-        </w:rPr>
-        <w:t>Advanced Data Science (IBM) | Deep Learning (IIT Madras) | Machine Learning (IIT Madras) | Node.js (Pirple)</w:t>
-      </w:r>
-    </w:p>
     <w:sectPr>
       <w:pgSz w:w="12240" w:h="15840"/>
       <w:pgMar w:top="576" w:right="720" w:bottom="576" w:left="720" w:header="720" w:footer="720" w:gutter="0"/>

</xml_diff>